<commit_message>
refine booking date-range picker styling/behavior and remove SMTP settings from compose
</commit_message>
<xml_diff>
--- a/docs/auth-postman-guide.docx
+++ b/docs/auth-postman-guide.docx
@@ -1,6 +1,6 @@
 
 <file path=word/document.xml><?xml version="1.0" encoding="utf-8"?>
-<w:document xmlns:wpc="http://schemas.microsoft.com/office/word/2010/wordprocessingCanvas" xmlns:mc="http://schemas.openxmlformats.org/markup-compatibility/2006" xmlns:o="urn:schemas-microsoft-com:office:office" xmlns:r="http://schemas.openxmlformats.org/officeDocument/2006/relationships" xmlns:m="http://schemas.openxmlformats.org/officeDocument/2006/math" xmlns:v="urn:schemas-microsoft-com:vml" xmlns:wp14="http://schemas.microsoft.com/office/word/2010/wordprocessingDrawing" xmlns:wp="http://schemas.openxmlformats.org/drawingml/2006/wordprocessingDrawing" xmlns:w10="urn:schemas-microsoft-com:office:word" xmlns:w="http://schemas.openxmlformats.org/wordprocessingml/2006/main" xmlns:w14="http://schemas.microsoft.com/office/word/2010/wordml" xmlns:wpg="http://schemas.microsoft.com/office/word/2010/wordprocessingGroup" xmlns:wpi="http://schemas.microsoft.com/office/word/2010/wordprocessingInk" xmlns:wne="http://schemas.microsoft.com/office/2006/wordml" xmlns:wps="http://schemas.microsoft.com/office/word/2010/wordprocessingShape" mc:Ignorable="w14 wp14">
+<w:document xmlns:wpc="http://schemas.microsoft.com/office/word/2010/wordprocessingCanvas" xmlns:mc="http://schemas.openxmlformats.org/markup-compatibility/2006" xmlns:o="urn:schemas-microsoft-com:office:office" xmlns:r="http://schemas.openxmlformats.org/officeDocument/2006/relationships" xmlns:m="http://schemas.openxmlformats.org/officeDocument/2006/math" xmlns:v="urn:schemas-microsoft-com:vml" xmlns:wp14="http://schemas.microsoft.com/office/word/2010/wordprocessingDrawing" xmlns:wp="http://schemas.openxmlformats.org/drawingml/2006/wordprocessingDrawing" xmlns:w10="urn:schemas-microsoft-com:office:word" xmlns:w="http://schemas.openxmlformats.org/wordprocessingml/2006/main" xmlns:w14="http://schemas.microsoft.com/office/word/2010/wordml" xmlns:wpg="http://schemas.microsoft.com/office/word/2010/wordprocessingGroup" xmlns:wpi="http://schemas.microsoft.com/office/word/2010/wordprocessingInk" xmlns:wne="http://schemas.microsoft.com/office/word/2006/wordml" xmlns:wps="http://schemas.microsoft.com/office/word/2010/wordprocessingShape" mc:Ignorable="w14 wp14">
   <w:body>
     <w:p>
       <w:r>
@@ -16,24 +16,58 @@
     <w:p/>
     <w:p>
       <w:r>
-        <w:t xml:space="preserve">Tai lieu nay dung de test luong dang ky, dang nhap, refresh token, logout va lay thong tin nguoi dung bang Postman.</w:t>
-      </w:r>
-    </w:p>
-    <w:p/>
-    <w:p>
-      <w:r>
-        <w:t xml:space="preserve">He thong da duoc tach thanh 2 nhom tai khoan:</w:t>
-      </w:r>
-    </w:p>
-    <w:p/>
-    <w:p>
-      <w:r>
-        <w:t xml:space="preserve">- `BUSINESS`: tai khoan doanh nghiep, co tao `tenant` va `memberships`</w:t>
-      </w:r>
-    </w:p>
-    <w:p>
-      <w:r>
-        <w:t xml:space="preserve">- `CUSTOMER`: tai khoan khach hang, chi tao `user`, khong tao `tenant`</w:t>
+        <w:t xml:space="preserve">Tai lieu nay dung de test cac luong auth hien co bang Postman:</w:t>
+      </w:r>
+    </w:p>
+    <w:p/>
+    <w:p>
+      <w:r>
+        <w:t xml:space="preserve">- Dang ky doanh nghiep</w:t>
+      </w:r>
+    </w:p>
+    <w:p>
+      <w:r>
+        <w:t xml:space="preserve">- Dang nhap doanh nghiep</w:t>
+      </w:r>
+    </w:p>
+    <w:p>
+      <w:r>
+        <w:t xml:space="preserve">- Dang ky khach hang</w:t>
+      </w:r>
+    </w:p>
+    <w:p>
+      <w:r>
+        <w:t xml:space="preserve">- Dang nhap khach hang</w:t>
+      </w:r>
+    </w:p>
+    <w:p>
+      <w:r>
+        <w:t xml:space="preserve">- Lay thong tin user</w:t>
+      </w:r>
+    </w:p>
+    <w:p>
+      <w:r>
+        <w:t xml:space="preserve">- Refresh token</w:t>
+      </w:r>
+    </w:p>
+    <w:p>
+      <w:r>
+        <w:t xml:space="preserve">- Logout</w:t>
+      </w:r>
+    </w:p>
+    <w:p>
+      <w:r>
+        <w:t xml:space="preserve">- Quen mat khau: gui OTP qua email</w:t>
+      </w:r>
+    </w:p>
+    <w:p>
+      <w:r>
+        <w:t xml:space="preserve">- Quen mat khau: xac thuc OTP</w:t>
+      </w:r>
+    </w:p>
+    <w:p>
+      <w:r>
+        <w:t xml:space="preserve">- Quen mat khau: doi mat khau moi</w:t>
       </w:r>
     </w:p>
     <w:p/>
@@ -238,22 +272,38 @@
     </w:p>
     <w:p>
       <w:r>
-        <w:t xml:space="preserve">  "hotelCount": 3,</w:t>
-      </w:r>
-    </w:p>
-    <w:p>
-      <w:r>
-        <w:t xml:space="preserve">  "domain": "smartstay.vn"</w:t>
-      </w:r>
-    </w:p>
-    <w:p>
-      <w:r>
-        <w:t xml:space="preserve">}</w:t>
-      </w:r>
-    </w:p>
-    <w:p>
-      <w:r>
-        <w:t xml:space="preserve">```</w:t>
+        <w:t xml:space="preserve">  "hotelCount": 3</w:t>
+      </w:r>
+    </w:p>
+    <w:p>
+      <w:r>
+        <w:t xml:space="preserve">}</w:t>
+      </w:r>
+    </w:p>
+    <w:p>
+      <w:r>
+        <w:t xml:space="preserve">```</w:t>
+      </w:r>
+    </w:p>
+    <w:p/>
+    <w:p>
+      <w:r>
+        <w:t xml:space="preserve">- Ghi chu:</w:t>
+      </w:r>
+    </w:p>
+    <w:p>
+      <w:r>
+        <w:t xml:space="preserve">  - `domain` la optional</w:t>
+      </w:r>
+    </w:p>
+    <w:p>
+      <w:r>
+        <w:t xml:space="preserve">  - Neu khong gui `domain`, backend se tu sinh tu `companyName`</w:t>
+      </w:r>
+    </w:p>
+    <w:p>
+      <w:r>
+        <w:t xml:space="preserve">  - Neu domain bi trung, backend se tu them hau to de dam bao duy nhat</w:t>
       </w:r>
     </w:p>
     <w:p/>
@@ -267,11 +317,6 @@
         <w:t xml:space="preserve">  - HTTP `201` hoac `200`</w:t>
       </w:r>
     </w:p>
-    <w:p>
-      <w:r>
-        <w:t xml:space="preserve">  - Response:</w:t>
-      </w:r>
-    </w:p>
     <w:p/>
     <w:p>
       <w:r>
@@ -452,11 +497,6 @@
         <w:t xml:space="preserve">  - HTTP `201` hoac `200`</w:t>
       </w:r>
     </w:p>
-    <w:p>
-      <w:r>
-        <w:t xml:space="preserve">  - Response:</w:t>
-      </w:r>
-    </w:p>
     <w:p/>
     <w:p>
       <w:r>
@@ -637,11 +677,6 @@
         <w:t xml:space="preserve">  - HTTP `201` hoac `200`</w:t>
       </w:r>
     </w:p>
-    <w:p>
-      <w:r>
-        <w:t xml:space="preserve">  - Response:</w:t>
-      </w:r>
-    </w:p>
     <w:p/>
     <w:p>
       <w:r>
@@ -797,11 +832,6 @@
         <w:t xml:space="preserve">  - HTTP `201` hoac `200`</w:t>
       </w:r>
     </w:p>
-    <w:p>
-      <w:r>
-        <w:t xml:space="preserve">  - Response:</w:t>
-      </w:r>
-    </w:p>
     <w:p/>
     <w:p>
       <w:r>
@@ -911,11 +941,6 @@
         <w:t xml:space="preserve">  - HTTP `200`</w:t>
       </w:r>
     </w:p>
-    <w:p>
-      <w:r>
-        <w:t xml:space="preserve">  - Response:</w:t>
-      </w:r>
-    </w:p>
     <w:p/>
     <w:p>
       <w:r>
@@ -1103,6 +1128,68 @@
     <w:p/>
     <w:p>
       <w:r>
+        <w:t xml:space="preserve">- Ky vong:</w:t>
+      </w:r>
+    </w:p>
+    <w:p>
+      <w:r>
+        <w:t xml:space="preserve">  - HTTP `201` hoac `200`</w:t>
+      </w:r>
+    </w:p>
+    <w:p/>
+    <w:p>
+      <w:r>
+        <w:t xml:space="preserve">```json</w:t>
+      </w:r>
+    </w:p>
+    <w:p>
+      <w:r>
+        <w:t xml:space="preserve">{</w:t>
+      </w:r>
+    </w:p>
+    <w:p>
+      <w:r>
+        <w:t xml:space="preserve">  "success": true,</w:t>
+      </w:r>
+    </w:p>
+    <w:p>
+      <w:r>
+        <w:t xml:space="preserve">  "message": "Refresh token successful",</w:t>
+      </w:r>
+    </w:p>
+    <w:p>
+      <w:r>
+        <w:t xml:space="preserve">  "payload": {</w:t>
+      </w:r>
+    </w:p>
+    <w:p>
+      <w:r>
+        <w:t xml:space="preserve">    "accessToken": "new_access_token",</w:t>
+      </w:r>
+    </w:p>
+    <w:p>
+      <w:r>
+        <w:t xml:space="preserve">    "refreshToken": "new_refresh_token"</w:t>
+      </w:r>
+    </w:p>
+    <w:p>
+      <w:r>
+        <w:t xml:space="preserve">  }</w:t>
+      </w:r>
+    </w:p>
+    <w:p>
+      <w:r>
+        <w:t xml:space="preserve">}</w:t>
+      </w:r>
+    </w:p>
+    <w:p>
+      <w:r>
+        <w:t xml:space="preserve">```</w:t>
+      </w:r>
+    </w:p>
+    <w:p/>
+    <w:p>
+      <w:r>
         <w:t xml:space="preserve">## 7. Logout</w:t>
       </w:r>
     </w:p>
@@ -1161,6 +1248,660 @@
     <w:p/>
     <w:p>
       <w:r>
+        <w:t xml:space="preserve">- Ky vong:</w:t>
+      </w:r>
+    </w:p>
+    <w:p>
+      <w:r>
+        <w:t xml:space="preserve">  - HTTP `201` hoac `200`</w:t>
+      </w:r>
+    </w:p>
+    <w:p/>
+    <w:p>
+      <w:r>
+        <w:t xml:space="preserve">```json</w:t>
+      </w:r>
+    </w:p>
+    <w:p>
+      <w:r>
+        <w:t xml:space="preserve">{</w:t>
+      </w:r>
+    </w:p>
+    <w:p>
+      <w:r>
+        <w:t xml:space="preserve">  "success": true,</w:t>
+      </w:r>
+    </w:p>
+    <w:p>
+      <w:r>
+        <w:t xml:space="preserve">  "message": "Logout successful",</w:t>
+      </w:r>
+    </w:p>
+    <w:p>
+      <w:r>
+        <w:t xml:space="preserve">  "payload": {</w:t>
+      </w:r>
+    </w:p>
+    <w:p>
+      <w:r>
+        <w:t xml:space="preserve">    "success": true</w:t>
+      </w:r>
+    </w:p>
+    <w:p>
+      <w:r>
+        <w:t xml:space="preserve">  }</w:t>
+      </w:r>
+    </w:p>
+    <w:p>
+      <w:r>
+        <w:t xml:space="preserve">}</w:t>
+      </w:r>
+    </w:p>
+    <w:p>
+      <w:r>
+        <w:t xml:space="preserve">```</w:t>
+      </w:r>
+    </w:p>
+    <w:p/>
+    <w:p>
+      <w:r>
+        <w:t xml:space="preserve">## 8. Quen mat khau - Gui OTP</w:t>
+      </w:r>
+    </w:p>
+    <w:p/>
+    <w:p>
+      <w:r>
+        <w:t xml:space="preserve">- Method: `POST`</w:t>
+      </w:r>
+    </w:p>
+    <w:p>
+      <w:r>
+        <w:t xml:space="preserve">- URL: `http://localhost:8081/auth/forgot-password/request`</w:t>
+      </w:r>
+    </w:p>
+    <w:p>
+      <w:r>
+        <w:t xml:space="preserve">- Headers:</w:t>
+      </w:r>
+    </w:p>
+    <w:p>
+      <w:r>
+        <w:t xml:space="preserve">  - `Content-Type: application/json`</w:t>
+      </w:r>
+    </w:p>
+    <w:p>
+      <w:r>
+        <w:t xml:space="preserve">- Body:</w:t>
+      </w:r>
+    </w:p>
+    <w:p/>
+    <w:p>
+      <w:r>
+        <w:t xml:space="preserve">```json</w:t>
+      </w:r>
+    </w:p>
+    <w:p>
+      <w:r>
+        <w:t xml:space="preserve">{</w:t>
+      </w:r>
+    </w:p>
+    <w:p>
+      <w:r>
+        <w:t xml:space="preserve">  "email": "customer@example.com"</w:t>
+      </w:r>
+    </w:p>
+    <w:p>
+      <w:r>
+        <w:t xml:space="preserve">}</w:t>
+      </w:r>
+    </w:p>
+    <w:p>
+      <w:r>
+        <w:t xml:space="preserve">```</w:t>
+      </w:r>
+    </w:p>
+    <w:p/>
+    <w:p>
+      <w:r>
+        <w:t xml:space="preserve">- Ky vong:</w:t>
+      </w:r>
+    </w:p>
+    <w:p>
+      <w:r>
+        <w:t xml:space="preserve">  - HTTP `200`</w:t>
+      </w:r>
+    </w:p>
+    <w:p/>
+    <w:p>
+      <w:r>
+        <w:t xml:space="preserve">```json</w:t>
+      </w:r>
+    </w:p>
+    <w:p>
+      <w:r>
+        <w:t xml:space="preserve">{</w:t>
+      </w:r>
+    </w:p>
+    <w:p>
+      <w:r>
+        <w:t xml:space="preserve">  "success": true,</w:t>
+      </w:r>
+    </w:p>
+    <w:p>
+      <w:r>
+        <w:t xml:space="preserve">  "message": "OTP sent successfully",</w:t>
+      </w:r>
+    </w:p>
+    <w:p>
+      <w:r>
+        <w:t xml:space="preserve">  "payload": {</w:t>
+      </w:r>
+    </w:p>
+    <w:p>
+      <w:r>
+        <w:t xml:space="preserve">    "email": "customer@example.com",</w:t>
+      </w:r>
+    </w:p>
+    <w:p>
+      <w:r>
+        <w:t xml:space="preserve">    "expiresInSeconds": 600,</w:t>
+      </w:r>
+    </w:p>
+    <w:p>
+      <w:r>
+        <w:t xml:space="preserve">    "delivery": "email"</w:t>
+      </w:r>
+    </w:p>
+    <w:p>
+      <w:r>
+        <w:t xml:space="preserve">  }</w:t>
+      </w:r>
+    </w:p>
+    <w:p>
+      <w:r>
+        <w:t xml:space="preserve">}</w:t>
+      </w:r>
+    </w:p>
+    <w:p>
+      <w:r>
+        <w:t xml:space="preserve">```</w:t>
+      </w:r>
+    </w:p>
+    <w:p/>
+    <w:p>
+      <w:r>
+        <w:t xml:space="preserve">- Ghi chu:</w:t>
+      </w:r>
+    </w:p>
+    <w:p>
+      <w:r>
+        <w:t xml:space="preserve">  - Neu chua cau hinh SMTP, backend co the tra them `otpPreview` trong `payload` de test local</w:t>
+      </w:r>
+    </w:p>
+    <w:p>
+      <w:r>
+        <w:t xml:space="preserve">  - Khi co SMTP that, OTP se duoc gui ve email</w:t>
+      </w:r>
+    </w:p>
+    <w:p/>
+    <w:p>
+      <w:r>
+        <w:t xml:space="preserve">## Dieu kien de OTP gui duoc qua email that</w:t>
+      </w:r>
+    </w:p>
+    <w:p/>
+    <w:p>
+      <w:r>
+        <w:t xml:space="preserve">De API `POST /auth/forgot-password/request` gui OTP ve email that, can dam bao:</w:t>
+      </w:r>
+    </w:p>
+    <w:p/>
+    <w:p>
+      <w:r>
+        <w:t xml:space="preserve">- `auth-service` dang chay</w:t>
+      </w:r>
+    </w:p>
+    <w:p>
+      <w:r>
+        <w:t xml:space="preserve">- PostgreSQL dang ket noi thanh cong</w:t>
+      </w:r>
+    </w:p>
+    <w:p>
+      <w:r>
+        <w:t xml:space="preserve">- da cau hinh SMTP hop le</w:t>
+      </w:r>
+    </w:p>
+    <w:p/>
+    <w:p>
+      <w:r>
+        <w:t xml:space="preserve">### Cau hinh SMTP voi Gmail</w:t>
+      </w:r>
+    </w:p>
+    <w:p/>
+    <w:p>
+      <w:r>
+        <w:t xml:space="preserve">```env</w:t>
+      </w:r>
+    </w:p>
+    <w:p>
+      <w:r>
+        <w:t xml:space="preserve">SMTP_HOST=smtp.gmail.com</w:t>
+      </w:r>
+    </w:p>
+    <w:p>
+      <w:r>
+        <w:t xml:space="preserve">SMTP_PORT=587</w:t>
+      </w:r>
+    </w:p>
+    <w:p>
+      <w:r>
+        <w:t xml:space="preserve">SMTP_USER=dangphamdangkhoa21@gmail.com</w:t>
+      </w:r>
+    </w:p>
+    <w:p>
+      <w:r>
+        <w:t xml:space="preserve">SMTP_PASS=YOUR_NEW_APP_PASSWORD</w:t>
+      </w:r>
+    </w:p>
+    <w:p>
+      <w:r>
+        <w:t xml:space="preserve">SMTP_FROM=dangphamdangkhoa21@gmail.com</w:t>
+      </w:r>
+    </w:p>
+    <w:p>
+      <w:r>
+        <w:t xml:space="preserve">```</w:t>
+      </w:r>
+    </w:p>
+    <w:p/>
+    <w:p>
+      <w:r>
+        <w:t xml:space="preserve">### Cach xac nhan da gui mail that</w:t>
+      </w:r>
+    </w:p>
+    <w:p/>
+    <w:p>
+      <w:r>
+        <w:t xml:space="preserve">Neu thanh cong, response se co:</w:t>
+      </w:r>
+    </w:p>
+    <w:p/>
+    <w:p>
+      <w:r>
+        <w:t xml:space="preserve">```json</w:t>
+      </w:r>
+    </w:p>
+    <w:p>
+      <w:r>
+        <w:t xml:space="preserve">{</w:t>
+      </w:r>
+    </w:p>
+    <w:p>
+      <w:r>
+        <w:t xml:space="preserve">  "success": true,</w:t>
+      </w:r>
+    </w:p>
+    <w:p>
+      <w:r>
+        <w:t xml:space="preserve">  "message": "OTP sent successfully",</w:t>
+      </w:r>
+    </w:p>
+    <w:p>
+      <w:r>
+        <w:t xml:space="preserve">  "payload": {</w:t>
+      </w:r>
+    </w:p>
+    <w:p>
+      <w:r>
+        <w:t xml:space="preserve">    "email": "customer@example.com",</w:t>
+      </w:r>
+    </w:p>
+    <w:p>
+      <w:r>
+        <w:t xml:space="preserve">    "expiresInSeconds": 600,</w:t>
+      </w:r>
+    </w:p>
+    <w:p>
+      <w:r>
+        <w:t xml:space="preserve">    "delivery": "email"</w:t>
+      </w:r>
+    </w:p>
+    <w:p>
+      <w:r>
+        <w:t xml:space="preserve">  }</w:t>
+      </w:r>
+    </w:p>
+    <w:p>
+      <w:r>
+        <w:t xml:space="preserve">}</w:t>
+      </w:r>
+    </w:p>
+    <w:p>
+      <w:r>
+        <w:t xml:space="preserve">```</w:t>
+      </w:r>
+    </w:p>
+    <w:p/>
+    <w:p>
+      <w:r>
+        <w:t xml:space="preserve">Neu response van la:</w:t>
+      </w:r>
+    </w:p>
+    <w:p/>
+    <w:p>
+      <w:r>
+        <w:t xml:space="preserve">```json</w:t>
+      </w:r>
+    </w:p>
+    <w:p>
+      <w:r>
+        <w:t xml:space="preserve">{</w:t>
+      </w:r>
+    </w:p>
+    <w:p>
+      <w:r>
+        <w:t xml:space="preserve">  "success": true,</w:t>
+      </w:r>
+    </w:p>
+    <w:p>
+      <w:r>
+        <w:t xml:space="preserve">  "message": "OTP sent successfully",</w:t>
+      </w:r>
+    </w:p>
+    <w:p>
+      <w:r>
+        <w:t xml:space="preserve">  "payload": {</w:t>
+      </w:r>
+    </w:p>
+    <w:p>
+      <w:r>
+        <w:t xml:space="preserve">    "delivery": "mock",</w:t>
+      </w:r>
+    </w:p>
+    <w:p>
+      <w:r>
+        <w:t xml:space="preserve">    "otpPreview": "123456"</w:t>
+      </w:r>
+    </w:p>
+    <w:p>
+      <w:r>
+        <w:t xml:space="preserve">  }</w:t>
+      </w:r>
+    </w:p>
+    <w:p>
+      <w:r>
+        <w:t xml:space="preserve">}</w:t>
+      </w:r>
+    </w:p>
+    <w:p>
+      <w:r>
+        <w:t xml:space="preserve">```</w:t>
+      </w:r>
+    </w:p>
+    <w:p/>
+    <w:p>
+      <w:r>
+        <w:t xml:space="preserve">thi nghia la backend chua doc du bien SMTP that.</w:t>
+      </w:r>
+    </w:p>
+    <w:p/>
+    <w:p>
+      <w:r>
+        <w:t xml:space="preserve">## 9. Quen mat khau - Xac thuc OTP</w:t>
+      </w:r>
+    </w:p>
+    <w:p/>
+    <w:p>
+      <w:r>
+        <w:t xml:space="preserve">- Method: `POST`</w:t>
+      </w:r>
+    </w:p>
+    <w:p>
+      <w:r>
+        <w:t xml:space="preserve">- URL: `http://localhost:8081/auth/forgot-password/verify-otp`</w:t>
+      </w:r>
+    </w:p>
+    <w:p>
+      <w:r>
+        <w:t xml:space="preserve">- Headers:</w:t>
+      </w:r>
+    </w:p>
+    <w:p>
+      <w:r>
+        <w:t xml:space="preserve">  - `Content-Type: application/json`</w:t>
+      </w:r>
+    </w:p>
+    <w:p>
+      <w:r>
+        <w:t xml:space="preserve">- Body:</w:t>
+      </w:r>
+    </w:p>
+    <w:p/>
+    <w:p>
+      <w:r>
+        <w:t xml:space="preserve">```json</w:t>
+      </w:r>
+    </w:p>
+    <w:p>
+      <w:r>
+        <w:t xml:space="preserve">{</w:t>
+      </w:r>
+    </w:p>
+    <w:p>
+      <w:r>
+        <w:t xml:space="preserve">  "email": "customer@example.com",</w:t>
+      </w:r>
+    </w:p>
+    <w:p>
+      <w:r>
+        <w:t xml:space="preserve">  "otp": "123456"</w:t>
+      </w:r>
+    </w:p>
+    <w:p>
+      <w:r>
+        <w:t xml:space="preserve">}</w:t>
+      </w:r>
+    </w:p>
+    <w:p>
+      <w:r>
+        <w:t xml:space="preserve">```</w:t>
+      </w:r>
+    </w:p>
+    <w:p/>
+    <w:p>
+      <w:r>
+        <w:t xml:space="preserve">- Ky vong:</w:t>
+      </w:r>
+    </w:p>
+    <w:p>
+      <w:r>
+        <w:t xml:space="preserve">  - HTTP `200`</w:t>
+      </w:r>
+    </w:p>
+    <w:p/>
+    <w:p>
+      <w:r>
+        <w:t xml:space="preserve">```json</w:t>
+      </w:r>
+    </w:p>
+    <w:p>
+      <w:r>
+        <w:t xml:space="preserve">{</w:t>
+      </w:r>
+    </w:p>
+    <w:p>
+      <w:r>
+        <w:t xml:space="preserve">  "success": true,</w:t>
+      </w:r>
+    </w:p>
+    <w:p>
+      <w:r>
+        <w:t xml:space="preserve">  "message": "OTP verified successfully",</w:t>
+      </w:r>
+    </w:p>
+    <w:p>
+      <w:r>
+        <w:t xml:space="preserve">  "payload": {</w:t>
+      </w:r>
+    </w:p>
+    <w:p>
+      <w:r>
+        <w:t xml:space="preserve">    "email": "customer@example.com",</w:t>
+      </w:r>
+    </w:p>
+    <w:p>
+      <w:r>
+        <w:t xml:space="preserve">    "verified": true</w:t>
+      </w:r>
+    </w:p>
+    <w:p>
+      <w:r>
+        <w:t xml:space="preserve">  }</w:t>
+      </w:r>
+    </w:p>
+    <w:p>
+      <w:r>
+        <w:t xml:space="preserve">}</w:t>
+      </w:r>
+    </w:p>
+    <w:p>
+      <w:r>
+        <w:t xml:space="preserve">```</w:t>
+      </w:r>
+    </w:p>
+    <w:p/>
+    <w:p>
+      <w:r>
+        <w:t xml:space="preserve">## 10. Quen mat khau - Doi mat khau moi</w:t>
+      </w:r>
+    </w:p>
+    <w:p/>
+    <w:p>
+      <w:r>
+        <w:t xml:space="preserve">- Method: `POST`</w:t>
+      </w:r>
+    </w:p>
+    <w:p>
+      <w:r>
+        <w:t xml:space="preserve">- URL: `http://localhost:8081/auth/forgot-password/reset-password`</w:t>
+      </w:r>
+    </w:p>
+    <w:p>
+      <w:r>
+        <w:t xml:space="preserve">- Headers:</w:t>
+      </w:r>
+    </w:p>
+    <w:p>
+      <w:r>
+        <w:t xml:space="preserve">  - `Content-Type: application/json`</w:t>
+      </w:r>
+    </w:p>
+    <w:p>
+      <w:r>
+        <w:t xml:space="preserve">- Body:</w:t>
+      </w:r>
+    </w:p>
+    <w:p/>
+    <w:p>
+      <w:r>
+        <w:t xml:space="preserve">```json</w:t>
+      </w:r>
+    </w:p>
+    <w:p>
+      <w:r>
+        <w:t xml:space="preserve">{</w:t>
+      </w:r>
+    </w:p>
+    <w:p>
+      <w:r>
+        <w:t xml:space="preserve">  "email": "customer@example.com",</w:t>
+      </w:r>
+    </w:p>
+    <w:p>
+      <w:r>
+        <w:t xml:space="preserve">  "otp": "123456",</w:t>
+      </w:r>
+    </w:p>
+    <w:p>
+      <w:r>
+        <w:t xml:space="preserve">  "newPassword": "newStrongPassword123"</w:t>
+      </w:r>
+    </w:p>
+    <w:p>
+      <w:r>
+        <w:t xml:space="preserve">}</w:t>
+      </w:r>
+    </w:p>
+    <w:p>
+      <w:r>
+        <w:t xml:space="preserve">```</w:t>
+      </w:r>
+    </w:p>
+    <w:p/>
+    <w:p>
+      <w:r>
+        <w:t xml:space="preserve">- Ky vong:</w:t>
+      </w:r>
+    </w:p>
+    <w:p>
+      <w:r>
+        <w:t xml:space="preserve">  - HTTP `200`</w:t>
+      </w:r>
+    </w:p>
+    <w:p/>
+    <w:p>
+      <w:r>
+        <w:t xml:space="preserve">```json</w:t>
+      </w:r>
+    </w:p>
+    <w:p>
+      <w:r>
+        <w:t xml:space="preserve">{</w:t>
+      </w:r>
+    </w:p>
+    <w:p>
+      <w:r>
+        <w:t xml:space="preserve">  "success": true,</w:t>
+      </w:r>
+    </w:p>
+    <w:p>
+      <w:r>
+        <w:t xml:space="preserve">  "message": "Password reset successful",</w:t>
+      </w:r>
+    </w:p>
+    <w:p>
+      <w:r>
+        <w:t xml:space="preserve">  "payload": {</w:t>
+      </w:r>
+    </w:p>
+    <w:p>
+      <w:r>
+        <w:t xml:space="preserve">    "email": "customer@example.com",</w:t>
+      </w:r>
+    </w:p>
+    <w:p>
+      <w:r>
+        <w:t xml:space="preserve">    "passwordReset": true</w:t>
+      </w:r>
+    </w:p>
+    <w:p>
+      <w:r>
+        <w:t xml:space="preserve">  }</w:t>
+      </w:r>
+    </w:p>
+    <w:p>
+      <w:r>
+        <w:t xml:space="preserve">}</w:t>
+      </w:r>
+    </w:p>
+    <w:p>
+      <w:r>
+        <w:t xml:space="preserve">```</w:t>
+      </w:r>
+    </w:p>
+    <w:p/>
+    <w:p>
+      <w:r>
         <w:t xml:space="preserve">## Thu tu test khuyen nghi tren Postman</w:t>
       </w:r>
     </w:p>
@@ -1172,22 +1913,42 @@
     </w:p>
     <w:p>
       <w:r>
-        <w:t xml:space="preserve">2. Lay `accessToken` va `refreshToken`</w:t>
-      </w:r>
-    </w:p>
-    <w:p>
-      <w:r>
-        <w:t xml:space="preserve">3. Goi `Me`</w:t>
-      </w:r>
-    </w:p>
-    <w:p>
-      <w:r>
-        <w:t xml:space="preserve">4. Goi `Refresh`</w:t>
-      </w:r>
-    </w:p>
-    <w:p>
-      <w:r>
-        <w:t xml:space="preserve">5. Goi `Logout`</w:t>
+        <w:t xml:space="preserve">2. Goi `Business Login` hoac `Customer Login`</w:t>
+      </w:r>
+    </w:p>
+    <w:p>
+      <w:r>
+        <w:t xml:space="preserve">3. Lay `accessToken` va `refreshToken`</w:t>
+      </w:r>
+    </w:p>
+    <w:p>
+      <w:r>
+        <w:t xml:space="preserve">4. Goi `Me`</w:t>
+      </w:r>
+    </w:p>
+    <w:p>
+      <w:r>
+        <w:t xml:space="preserve">5. Goi `Refresh`</w:t>
+      </w:r>
+    </w:p>
+    <w:p>
+      <w:r>
+        <w:t xml:space="preserve">6. Goi `Logout`</w:t>
+      </w:r>
+    </w:p>
+    <w:p>
+      <w:r>
+        <w:t xml:space="preserve">7. Goi `Forgot Password Request`</w:t>
+      </w:r>
+    </w:p>
+    <w:p>
+      <w:r>
+        <w:t xml:space="preserve">8. Goi `Forgot Password Verify OTP`</w:t>
+      </w:r>
+    </w:p>
+    <w:p>
+      <w:r>
+        <w:t xml:space="preserve">9. Goi `Forgot Password Reset Password`</w:t>
       </w:r>
     </w:p>
     <w:p/>
@@ -1246,6 +2007,27 @@
     <w:p>
       <w:r>
         <w:t xml:space="preserve">```</w:t>
+      </w:r>
+    </w:p>
+    <w:p/>
+    <w:p>
+      <w:r>
+        <w:t xml:space="preserve">- Frontend web hien tai luu token vao `localStorage` voi cac key:</w:t>
+      </w:r>
+    </w:p>
+    <w:p>
+      <w:r>
+        <w:t xml:space="preserve">  - `smartstay_access_token`</w:t>
+      </w:r>
+    </w:p>
+    <w:p>
+      <w:r>
+        <w:t xml:space="preserve">  - `smartstay_refresh_token`</w:t>
+      </w:r>
+    </w:p>
+    <w:p>
+      <w:r>
+        <w:t xml:space="preserve">  - `smartstay_user`</w:t>
       </w:r>
     </w:p>
     <w:sectPr>

</xml_diff>